<commit_message>
[FIX] Video youtube + CFA
</commit_message>
<xml_diff>
--- a/fuentes/CF4_240201524_DU.docx
+++ b/fuentes/CF4_240201524_DU.docx
@@ -203,7 +203,7 @@
           </mc:Choice>
           <mc:Fallback>
             <w:pict>
-              <v:rect w14:anchorId="6B9FF61E" id="Rectángulo 3" o:spid="_x0000_s1026" alt="&quot;&quot;" style="position:absolute;margin-left:-55.6pt;margin-top:37.3pt;width:613.85pt;height:185.45pt;z-index:-251655168;visibility:visible;mso-wrap-style:square;mso-height-percent:0;mso-wrap-distance-left:9pt;mso-wrap-distance-top:0;mso-wrap-distance-right:9pt;mso-wrap-distance-bottom:0;mso-position-horizontal:absolute;mso-position-horizontal-relative:text;mso-position-vertical:absolute;mso-position-vertical-relative:text;mso-height-percent:0;mso-height-relative:margin;v-text-anchor:middle" o:gfxdata="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" fillcolor="#00314d" stroked="f" strokeweight="1pt"/>
+              <v:rect w14:anchorId="2D33467C" id="Rectángulo 3" o:spid="_x0000_s1026" alt="&quot;&quot;" style="position:absolute;margin-left:-55.6pt;margin-top:37.3pt;width:613.85pt;height:185.45pt;z-index:-251655168;visibility:visible;mso-wrap-style:square;mso-height-percent:0;mso-wrap-distance-left:9pt;mso-wrap-distance-top:0;mso-wrap-distance-right:9pt;mso-wrap-distance-bottom:0;mso-position-horizontal:absolute;mso-position-horizontal-relative:text;mso-position-vertical:absolute;mso-position-vertical-relative:text;mso-height-percent:0;mso-height-relative:margin;v-text-anchor:middle" o:gfxdata="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" fillcolor="#00314d" stroked="f" strokeweight="1pt"/>
             </w:pict>
           </mc:Fallback>
         </mc:AlternateContent>
@@ -514,8 +514,8 @@
         <w:br w:type="page"/>
       </w:r>
     </w:p>
-    <w:bookmarkStart w:id="0" w:name="_Toc205840292" w:displacedByCustomXml="next"/>
-    <w:bookmarkStart w:id="1" w:name="_Toc205839740" w:displacedByCustomXml="next"/>
+    <w:bookmarkStart w:id="0" w:name="_Toc205839740" w:displacedByCustomXml="next"/>
+    <w:bookmarkStart w:id="1" w:name="_Toc205840292" w:displacedByCustomXml="next"/>
     <w:sdt>
       <w:sdtPr>
         <w:rPr>
@@ -2797,19 +2797,11 @@
         </w:rPr>
         <w:t xml:space="preserve"> Anexo 1. </w:t>
       </w:r>
-      <w:proofErr w:type="spellStart"/>
-      <w:r>
-        <w:rPr>
-          <w:lang w:val="es-419" w:eastAsia="es-CO"/>
-        </w:rPr>
-        <w:t>Infografía_Tipo_de_textos</w:t>
-      </w:r>
-      <w:proofErr w:type="spellEnd"/>
-      <w:r>
-        <w:rPr>
-          <w:lang w:val="es-419" w:eastAsia="es-CO"/>
-        </w:rPr>
-        <w:t>.</w:t>
+      <w:r>
+        <w:rPr>
+          <w:lang w:val="es-419" w:eastAsia="es-CO"/>
+        </w:rPr>
+        <w:t>Infografía_Tipo_de_textos.</w:t>
       </w:r>
     </w:p>
     <w:p>
@@ -2853,7 +2845,7 @@
         <w:rPr>
           <w:lang w:val="es-419" w:eastAsia="es-CO"/>
         </w:rPr>
-        <w:t>Importancia de los signos de puntuación</w:t>
+        <w:t>Importancia y utilización de los signos de puntuación</w:t>
       </w:r>
     </w:p>
     <w:p>
@@ -2868,10 +2860,10 @@
           <w:noProof/>
         </w:rPr>
         <w:drawing>
-          <wp:inline distT="0" distB="0" distL="0" distR="0" wp14:anchorId="2C68452C" wp14:editId="18F3F660">
-            <wp:extent cx="5187820" cy="2920620"/>
+          <wp:inline distT="0" distB="0" distL="0" distR="0" wp14:anchorId="16721328" wp14:editId="0A2201B7">
+            <wp:extent cx="5543550" cy="3067632"/>
             <wp:effectExtent l="0" t="0" r="0" b="0"/>
-            <wp:docPr id="1422647475" name="Imagen 4">
+            <wp:docPr id="1757204223" name="Imagen 3">
               <a:extLst xmlns:a="http://schemas.openxmlformats.org/drawingml/2006/main">
                 <a:ext uri="{C183D7F6-B498-43B3-948B-1728B52AA6E4}">
                   <adec:decorative xmlns:adec="http://schemas.microsoft.com/office/drawing/2017/decorative" val="1"/>
@@ -2885,7 +2877,7 @@
               <a:graphicData uri="http://schemas.openxmlformats.org/drawingml/2006/picture">
                 <pic:pic xmlns:pic="http://schemas.openxmlformats.org/drawingml/2006/picture">
                   <pic:nvPicPr>
-                    <pic:cNvPr id="1422647475" name="Imagen 4">
+                    <pic:cNvPr id="1757204223" name="Imagen 3">
                       <a:extLst>
                         <a:ext uri="{C183D7F6-B498-43B3-948B-1728B52AA6E4}">
                           <adec:decorative xmlns:adec="http://schemas.microsoft.com/office/drawing/2017/decorative" val="1"/>
@@ -2896,15 +2888,15 @@
                       <a:picLocks noChangeAspect="1" noChangeArrowheads="1"/>
                     </pic:cNvPicPr>
                   </pic:nvPicPr>
-                  <pic:blipFill>
-                    <a:blip r:embed="rId15" cstate="print">
+                  <pic:blipFill rotWithShape="1">
+                    <a:blip r:embed="rId15">
                       <a:extLst>
                         <a:ext uri="{28A0092B-C50C-407E-A947-70E740481C1C}">
                           <a14:useLocalDpi xmlns:a14="http://schemas.microsoft.com/office/drawing/2010/main" val="0"/>
                         </a:ext>
                       </a:extLst>
                     </a:blip>
-                    <a:srcRect/>
+                    <a:srcRect t="13012" b="13252"/>
                     <a:stretch>
                       <a:fillRect/>
                     </a:stretch>
@@ -2912,7 +2904,7 @@
                   <pic:spPr bwMode="auto">
                     <a:xfrm>
                       <a:off x="0" y="0"/>
-                      <a:ext cx="5207299" cy="2931586"/>
+                      <a:ext cx="5553086" cy="3072909"/>
                     </a:xfrm>
                     <a:prstGeom prst="rect">
                       <a:avLst/>
@@ -2921,6 +2913,11 @@
                     <a:ln>
                       <a:noFill/>
                     </a:ln>
+                    <a:extLst>
+                      <a:ext uri="{53640926-AAD7-44D8-BBD7-CCE9431645EC}">
+                        <a14:shadowObscured xmlns:a14="http://schemas.microsoft.com/office/drawing/2010/main"/>
+                      </a:ext>
+                    </a:extLst>
                   </pic:spPr>
                 </pic:pic>
               </a:graphicData>
@@ -2981,7 +2978,7 @@
                 <w:b/>
                 <w:bCs/>
               </w:rPr>
-              <w:t>Importancia de los signos de puntuación</w:t>
+              <w:t>Importancia y utilización de los signos de puntuación</w:t>
             </w:r>
           </w:p>
         </w:tc>
@@ -3964,33 +3961,8 @@
           <w:rStyle w:val="Extranjerismo"/>
           <w:lang w:val="es-419" w:eastAsia="es-CO"/>
         </w:rPr>
-        <w:t xml:space="preserve">American </w:t>
-      </w:r>
-      <w:proofErr w:type="spellStart"/>
-      <w:r>
-        <w:rPr>
-          <w:rStyle w:val="Extranjerismo"/>
-          <w:lang w:val="es-419" w:eastAsia="es-CO"/>
-        </w:rPr>
-        <w:t>Psichological</w:t>
-      </w:r>
-      <w:proofErr w:type="spellEnd"/>
-      <w:r>
-        <w:rPr>
-          <w:rStyle w:val="Extranjerismo"/>
-          <w:lang w:val="es-419" w:eastAsia="es-CO"/>
-        </w:rPr>
-        <w:t xml:space="preserve"> </w:t>
-      </w:r>
-      <w:proofErr w:type="spellStart"/>
-      <w:r>
-        <w:rPr>
-          <w:rStyle w:val="Extranjerismo"/>
-          <w:lang w:val="es-419" w:eastAsia="es-CO"/>
-        </w:rPr>
-        <w:t>Associatión</w:t>
-      </w:r>
-      <w:proofErr w:type="spellEnd"/>
+        <w:t>American Psichological Associatión</w:t>
+      </w:r>
       <w:r>
         <w:rPr>
           <w:lang w:val="es-419" w:eastAsia="es-CO"/>
@@ -4197,7 +4169,6 @@
         </w:rPr>
         <w:t>Resumen (</w:t>
       </w:r>
-      <w:proofErr w:type="spellStart"/>
       <w:r>
         <w:rPr>
           <w:rStyle w:val="Extranjerismo"/>
@@ -4205,7 +4176,6 @@
         </w:rPr>
         <w:t>Abstract</w:t>
       </w:r>
-      <w:proofErr w:type="spellEnd"/>
       <w:r>
         <w:rPr>
           <w:lang w:val="es-419" w:eastAsia="es-CO"/>
@@ -4441,10 +4411,10 @@
           <w:noProof/>
         </w:rPr>
         <w:drawing>
-          <wp:inline distT="0" distB="0" distL="0" distR="0" wp14:anchorId="15E73956" wp14:editId="51CB4E42">
-            <wp:extent cx="1819275" cy="2447925"/>
-            <wp:effectExtent l="0" t="0" r="9525" b="9525"/>
-            <wp:docPr id="111745552" name="Gráfico 1" descr="El formato de márgenes en estilo APA: 2.54 cm en todos los lados (superior, inferior, izquierdo y derecho). Este margen uniforme garantiza una presentación clara y profesional del documento."/>
+          <wp:inline distT="0" distB="0" distL="0" distR="0" wp14:anchorId="3FD441BA" wp14:editId="48E00A64">
+            <wp:extent cx="2453640" cy="3307754"/>
+            <wp:effectExtent l="0" t="0" r="3810" b="6985"/>
+            <wp:docPr id="32553774" name="Gráfico 1" descr="El formato de márgenes en estilo APA: 2.54 cm en todos los lados (superior, inferior, izquierdo y derecho). Este margen uniforme garantiza una presentación clara y profesional del documento."/>
             <wp:cNvGraphicFramePr>
               <a:graphicFrameLocks xmlns:a="http://schemas.openxmlformats.org/drawingml/2006/main" noChangeAspect="1"/>
             </wp:cNvGraphicFramePr>
@@ -4452,7 +4422,7 @@
               <a:graphicData uri="http://schemas.openxmlformats.org/drawingml/2006/picture">
                 <pic:pic xmlns:pic="http://schemas.openxmlformats.org/drawingml/2006/picture">
                   <pic:nvPicPr>
-                    <pic:cNvPr id="111745552" name="Gráfico 1" descr="El formato de márgenes en estilo APA: 2.54 cm en todos los lados (superior, inferior, izquierdo y derecho). Este margen uniforme garantiza una presentación clara y profesional del documento."/>
+                    <pic:cNvPr id="32553774" name="Gráfico 1" descr="El formato de márgenes en estilo APA: 2.54 cm en todos los lados (superior, inferior, izquierdo y derecho). Este margen uniforme garantiza una presentación clara y profesional del documento."/>
                     <pic:cNvPicPr/>
                   </pic:nvPicPr>
                   <pic:blipFill>
@@ -4470,7 +4440,7 @@
                   <pic:spPr>
                     <a:xfrm>
                       <a:off x="0" y="0"/>
-                      <a:ext cx="1819275" cy="2447925"/>
+                      <a:ext cx="2461758" cy="3318698"/>
                     </a:xfrm>
                     <a:prstGeom prst="rect">
                       <a:avLst/>
@@ -4554,19 +4524,11 @@
           <w:lang w:val="es-419" w:eastAsia="es-CO"/>
         </w:rPr>
       </w:pPr>
-      <w:proofErr w:type="spellStart"/>
-      <w:r>
-        <w:rPr>
-          <w:lang w:val="es-419" w:eastAsia="es-CO"/>
-        </w:rPr>
-        <w:t>Calibrí</w:t>
-      </w:r>
-      <w:proofErr w:type="spellEnd"/>
-      <w:r>
-        <w:rPr>
-          <w:lang w:val="es-419" w:eastAsia="es-CO"/>
-        </w:rPr>
-        <w:t xml:space="preserve"> 11 puntos.</w:t>
+      <w:r>
+        <w:rPr>
+          <w:lang w:val="es-419" w:eastAsia="es-CO"/>
+        </w:rPr>
+        <w:t>Calibrí 11 puntos.</w:t>
       </w:r>
     </w:p>
     <w:p>
@@ -4584,6 +4546,7 @@
         <w:rPr>
           <w:lang w:val="es-419" w:eastAsia="es-CO"/>
         </w:rPr>
+        <w:lastRenderedPageBreak/>
         <w:t>Arial 11 puntos.</w:t>
       </w:r>
     </w:p>
@@ -4620,22 +4583,7 @@
         <w:rPr>
           <w:lang w:val="es-419" w:eastAsia="es-CO"/>
         </w:rPr>
-        <w:lastRenderedPageBreak/>
-        <w:t xml:space="preserve">Times New </w:t>
-      </w:r>
-      <w:proofErr w:type="spellStart"/>
-      <w:r>
-        <w:rPr>
-          <w:lang w:val="es-419" w:eastAsia="es-CO"/>
-        </w:rPr>
-        <w:t>Roman</w:t>
-      </w:r>
-      <w:proofErr w:type="spellEnd"/>
-      <w:r>
-        <w:rPr>
-          <w:lang w:val="es-419" w:eastAsia="es-CO"/>
-        </w:rPr>
-        <w:t xml:space="preserve"> de 12 puntos.</w:t>
+        <w:t>Times New Roman de 12 puntos.</w:t>
       </w:r>
     </w:p>
     <w:p>
@@ -4667,19 +4615,11 @@
           <w:lang w:val="es-419" w:eastAsia="es-CO"/>
         </w:rPr>
       </w:pPr>
-      <w:proofErr w:type="spellStart"/>
-      <w:r>
-        <w:rPr>
-          <w:lang w:val="es-419" w:eastAsia="es-CO"/>
-        </w:rPr>
-        <w:t>Computer</w:t>
-      </w:r>
-      <w:proofErr w:type="spellEnd"/>
-      <w:r>
-        <w:rPr>
-          <w:lang w:val="es-419" w:eastAsia="es-CO"/>
-        </w:rPr>
-        <w:t xml:space="preserve"> Modern normal (10 puntos).</w:t>
+      <w:r>
+        <w:rPr>
+          <w:lang w:val="es-419" w:eastAsia="es-CO"/>
+        </w:rPr>
+        <w:t>Computer Modern normal (10 puntos).</w:t>
       </w:r>
     </w:p>
     <w:p>
@@ -4902,6 +4842,7 @@
           <w:bCs/>
           <w:lang w:val="es-419" w:eastAsia="es-CO"/>
         </w:rPr>
+        <w:lastRenderedPageBreak/>
         <w:t>Encabezado de página</w:t>
       </w:r>
     </w:p>
@@ -4932,7 +4873,6 @@
           <w:bCs/>
           <w:lang w:val="es-419" w:eastAsia="es-CO"/>
         </w:rPr>
-        <w:lastRenderedPageBreak/>
         <w:t>Números de página</w:t>
       </w:r>
     </w:p>
@@ -5259,24 +5199,6 @@
         </w:rPr>
         <w:t>El texto comienza en la misma línea y continúa como un párrafo regular.</w:t>
       </w:r>
-    </w:p>
-    <w:p>
-      <w:pPr>
-        <w:pStyle w:val="Prrafodelista"/>
-        <w:ind w:left="1429" w:firstLine="0"/>
-        <w:rPr>
-          <w:lang w:val="es-419" w:eastAsia="es-CO"/>
-        </w:rPr>
-      </w:pPr>
-    </w:p>
-    <w:p>
-      <w:pPr>
-        <w:pStyle w:val="Prrafodelista"/>
-        <w:ind w:left="1429" w:firstLine="0"/>
-        <w:rPr>
-          <w:lang w:val="es-419" w:eastAsia="es-CO"/>
-        </w:rPr>
-      </w:pPr>
     </w:p>
     <w:p>
       <w:pPr>
@@ -5845,25 +5767,7 @@
           <w:iCs/>
           <w:lang w:val="es-419" w:eastAsia="es-CO"/>
         </w:rPr>
-        <w:t xml:space="preserve">En: </w:t>
-      </w:r>
-      <w:proofErr w:type="spellStart"/>
-      <w:r>
-        <w:rPr>
-          <w:i/>
-          <w:iCs/>
-          <w:lang w:val="es-419" w:eastAsia="es-CO"/>
-        </w:rPr>
-        <w:t>Scientometrics</w:t>
-      </w:r>
-      <w:proofErr w:type="spellEnd"/>
-      <w:r>
-        <w:rPr>
-          <w:i/>
-          <w:iCs/>
-          <w:lang w:val="es-419" w:eastAsia="es-CO"/>
-        </w:rPr>
-        <w:t>. Budapest</w:t>
+        <w:t>En: Scientometrics. Budapest</w:t>
       </w:r>
       <w:r>
         <w:rPr>
@@ -5960,21 +5864,7 @@
         <w:rPr>
           <w:lang w:val="es-419" w:eastAsia="es-CO"/>
         </w:rPr>
-        <w:t xml:space="preserve">Para el caso que ocupa este curso, se enfocará la utilización de herramientas tecnológicas en contextos profesionales, ya sea desde la formación o el desempeño profesional, de manera que </w:t>
-      </w:r>
-      <w:proofErr w:type="gramStart"/>
-      <w:r>
-        <w:rPr>
-          <w:lang w:val="es-419" w:eastAsia="es-CO"/>
-        </w:rPr>
-        <w:t>la asertividad</w:t>
-      </w:r>
-      <w:proofErr w:type="gramEnd"/>
-      <w:r>
-        <w:rPr>
-          <w:lang w:val="es-419" w:eastAsia="es-CO"/>
-        </w:rPr>
-        <w:t xml:space="preserve"> caracterice la forma de emitir comunicados por medios tecnológicos.</w:t>
+        <w:t>Para el caso que ocupa este curso, se enfocará la utilización de herramientas tecnológicas en contextos profesionales, ya sea desde la formación o el desempeño profesional, de manera que la asertividad caracterice la forma de emitir comunicados por medios tecnológicos.</w:t>
       </w:r>
     </w:p>
     <w:p>
@@ -9208,19 +9098,9 @@
             <w:pPr>
               <w:pStyle w:val="TextoTablas"/>
             </w:pPr>
-            <w:proofErr w:type="spellStart"/>
-            <w:r>
-              <w:t>Zvi</w:t>
-            </w:r>
-            <w:proofErr w:type="spellEnd"/>
-            <w:r>
-              <w:t xml:space="preserve"> Daniel </w:t>
-            </w:r>
-            <w:proofErr w:type="spellStart"/>
-            <w:r>
-              <w:t>Grosman</w:t>
-            </w:r>
-            <w:proofErr w:type="spellEnd"/>
+            <w:r>
+              <w:t>Zvi Daniel Grosman</w:t>
+            </w:r>
           </w:p>
         </w:tc>
         <w:tc>
@@ -14299,19 +14179,6 @@
 </file>
 
 <file path=customXml/item2.xml><?xml version="1.0" encoding="utf-8"?>
-<b:Sources xmlns:b="http://schemas.openxmlformats.org/officeDocument/2006/bibliography" xmlns="http://schemas.openxmlformats.org/officeDocument/2006/bibliography" SelectedStyle="\APASixthEditionOfficeOnline.xsl" StyleName="APA" Version="6"/>
-</file>
-
-<file path=customXml/item3.xml><?xml version="1.0" encoding="utf-8"?>
-<?mso-contentType ?>
-<FormTemplates xmlns="http://schemas.microsoft.com/sharepoint/v3/contenttype/forms">
-  <Display>DocumentLibraryForm</Display>
-  <Edit>DocumentLibraryForm</Edit>
-  <New>DocumentLibraryForm</New>
-</FormTemplates>
-</file>
-
-<file path=customXml/item4.xml><?xml version="1.0" encoding="utf-8"?>
 <ct:contentTypeSchema xmlns:ct="http://schemas.microsoft.com/office/2006/metadata/contentType" xmlns:ma="http://schemas.microsoft.com/office/2006/metadata/properties/metaAttributes" ct:_="" ma:_="" ma:contentTypeName="Documento" ma:contentTypeID="0x0101005D7421CBAB376F47AC1876466873BE0C" ma:contentTypeVersion="11" ma:contentTypeDescription="Crear nuevo documento." ma:contentTypeScope="" ma:versionID="3a1bba6d8728ce939bf9f95dae234b40">
   <xsd:schema xmlns:xsd="http://www.w3.org/2001/XMLSchema" xmlns:xs="http://www.w3.org/2001/XMLSchema" xmlns:p="http://schemas.microsoft.com/office/2006/metadata/properties" xmlns:ns2="55abea07-cd72-4a95-add0-1082a24cf9e9" xmlns:ns3="285d351f-f218-493a-825f-85a9dfbde315" targetNamespace="http://schemas.microsoft.com/office/2006/metadata/properties" ma:root="true" ma:fieldsID="a4f96e62c8f781ccc064189483c2e669" ns2:_="" ns3:_="">
     <xsd:import namespace="55abea07-cd72-4a95-add0-1082a24cf9e9"/>
@@ -14506,6 +14373,19 @@
 </ct:contentTypeSchema>
 </file>
 
+<file path=customXml/item3.xml><?xml version="1.0" encoding="utf-8"?>
+<?mso-contentType ?>
+<FormTemplates xmlns="http://schemas.microsoft.com/sharepoint/v3/contenttype/forms">
+  <Display>DocumentLibraryForm</Display>
+  <Edit>DocumentLibraryForm</Edit>
+  <New>DocumentLibraryForm</New>
+</FormTemplates>
+</file>
+
+<file path=customXml/item4.xml><?xml version="1.0" encoding="utf-8"?>
+<b:Sources xmlns:b="http://schemas.openxmlformats.org/officeDocument/2006/bibliography" xmlns="http://schemas.openxmlformats.org/officeDocument/2006/bibliography" SelectedStyle="\APASixthEditionOfficeOnline.xsl" StyleName="APA" Version="6"/>
+</file>
+
 <file path=customXml/itemProps1.xml><?xml version="1.0" encoding="utf-8"?>
 <ds:datastoreItem xmlns:ds="http://schemas.openxmlformats.org/officeDocument/2006/customXml" ds:itemID="{26259216-AD86-464A-AEAD-95B1F9E17392}">
   <ds:schemaRefs>
@@ -14518,11 +14398,7 @@
 </file>
 
 <file path=customXml/itemProps2.xml><?xml version="1.0" encoding="utf-8"?>
-<ds:datastoreItem xmlns:ds="http://schemas.openxmlformats.org/officeDocument/2006/customXml" ds:itemID="{A9F2CEBA-C824-4C86-81A8-E32CBD0EB92D}">
-  <ds:schemaRefs>
-    <ds:schemaRef ds:uri="http://schemas.openxmlformats.org/officeDocument/2006/bibliography"/>
-  </ds:schemaRefs>
-</ds:datastoreItem>
+<ds:datastoreItem xmlns:ds="http://schemas.openxmlformats.org/officeDocument/2006/customXml" ds:itemID="{346BAFE8-4CDF-49BF-99C9-CF385C6C272F}"/>
 </file>
 
 <file path=customXml/itemProps3.xml><?xml version="1.0" encoding="utf-8"?>
@@ -14534,5 +14410,9 @@
 </file>
 
 <file path=customXml/itemProps4.xml><?xml version="1.0" encoding="utf-8"?>
-<ds:datastoreItem xmlns:ds="http://schemas.openxmlformats.org/officeDocument/2006/customXml" ds:itemID="{E7E39AF3-B992-4A93-AD33-E93FC2E2A92B}"/>
+<ds:datastoreItem xmlns:ds="http://schemas.openxmlformats.org/officeDocument/2006/customXml" ds:itemID="{A9F2CEBA-C824-4C86-81A8-E32CBD0EB92D}">
+  <ds:schemaRefs>
+    <ds:schemaRef ds:uri="http://schemas.openxmlformats.org/officeDocument/2006/bibliography"/>
+  </ds:schemaRefs>
+</ds:datastoreItem>
 </file>
</xml_diff>

<commit_message>
[FIX] Ajustes RAE + UPD CFA
</commit_message>
<xml_diff>
--- a/fuentes/CF4_240201524_DU.docx
+++ b/fuentes/CF4_240201524_DU.docx
@@ -322,7 +322,7 @@
                 <v:stroke joinstyle="miter"/>
                 <v:path gradientshapeok="t" o:connecttype="rect"/>
               </v:shapetype>
-              <v:shape id="Cuadro de texto 2" o:spid="_x0000_s1026" type="#_x0000_t202" alt="&quot;&quot;" style="position:absolute;left:0;text-align:left;margin-left:-19.6pt;margin-top:34.4pt;width:557.2pt;height:84.95pt;z-index:251663360;visibility:visible;mso-wrap-style:square;mso-width-percent:0;mso-height-percent:0;mso-wrap-distance-left:9pt;mso-wrap-distance-top:3.6pt;mso-wrap-distance-right:9pt;mso-wrap-distance-bottom:3.6pt;mso-position-horizontal:absolute;mso-position-horizontal-relative:text;mso-position-vertical:absolute;mso-position-vertical-relative:text;mso-width-percent:0;mso-height-percent:0;mso-width-relative:margin;mso-height-relative:margin;v-text-anchor:top" o:gfxdata="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" filled="f" stroked="f">
+              <v:shape id="Cuadro de texto 2" o:spid="_x0000_s1026" type="#_x0000_t202" alt="&quot;&quot;" style="position:absolute;left:0;text-align:left;margin-left:-19.6pt;margin-top:34.4pt;width:557.2pt;height:84.95pt;z-index:251663360;visibility:visible;mso-wrap-style:square;mso-width-percent:0;mso-height-percent:0;mso-wrap-distance-left:9pt;mso-wrap-distance-top:3.6pt;mso-wrap-distance-right:9pt;mso-wrap-distance-bottom:3.6pt;mso-position-horizontal:absolute;mso-position-horizontal-relative:text;mso-position-vertical:absolute;mso-position-vertical-relative:text;mso-width-percent:0;mso-height-percent:0;mso-width-relative:margin;mso-height-relative:margin;v-text-anchor:top" o:gfxdata="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" filled="f" stroked="f">
                 <v:textbox>
                   <w:txbxContent>
                     <w:p>
@@ -514,8 +514,8 @@
         <w:br w:type="page"/>
       </w:r>
     </w:p>
-    <w:bookmarkStart w:id="0" w:name="_Toc205839740" w:displacedByCustomXml="next"/>
-    <w:bookmarkStart w:id="1" w:name="_Toc205840292" w:displacedByCustomXml="next"/>
+    <w:bookmarkStart w:id="0" w:name="_Toc205840292" w:displacedByCustomXml="next"/>
+    <w:bookmarkStart w:id="1" w:name="_Toc205839740" w:displacedByCustomXml="next"/>
     <w:sdt>
       <w:sdtPr>
         <w:rPr>
@@ -977,10 +977,6 @@
         <w:p>
           <w:pPr>
             <w:pStyle w:val="TDC2"/>
-            <w:tabs>
-              <w:tab w:val="clear" w:pos="709"/>
-            </w:tabs>
-            <w:ind w:left="1134" w:hanging="141"/>
             <w:rPr>
               <w:rFonts w:eastAsiaTheme="minorEastAsia"/>
               <w:sz w:val="24"/>
@@ -1026,13 +1022,7 @@
               <w:rPr>
                 <w:rStyle w:val="Hipervnculo"/>
               </w:rPr>
-              <w:t xml:space="preserve">     </w:t>
-            </w:r>
-            <w:r>
-              <w:rPr>
-                <w:webHidden/>
-              </w:rPr>
-              <w:tab/>
+              <w:t xml:space="preserve"> ………………………………………………………………………………………………..</w:t>
             </w:r>
             <w:r>
               <w:rPr>
@@ -3339,7 +3329,13 @@
         <w:rPr>
           <w:lang w:val="es-419" w:eastAsia="es-CO"/>
         </w:rPr>
-        <w:t>Indica las semejanzas y diferencias entre dos más objetos, ideas o personas, comparándolos, según cierto número de categorías.</w:t>
+        <w:t>Indica las semejanzas y diferencias entre dos o más objetos, ideas o personas, comparándolos, según cierto número de categorías</w:t>
+      </w:r>
+      <w:r>
+        <w:rPr>
+          <w:lang w:val="es-419" w:eastAsia="es-CO"/>
+        </w:rPr>
+        <w:t>.</w:t>
       </w:r>
     </w:p>
     <w:p>
@@ -3676,12 +3672,13 @@
       <w:r>
         <w:rPr>
           <w:noProof/>
+          <w:lang w:val="es-419" w:eastAsia="es-CO"/>
         </w:rPr>
         <w:drawing>
-          <wp:inline distT="0" distB="0" distL="0" distR="0" wp14:anchorId="6937F79B" wp14:editId="31300F80">
-            <wp:extent cx="5872391" cy="2006930"/>
-            <wp:effectExtent l="0" t="0" r="0" b="0"/>
-            <wp:docPr id="867827319" name="Gráfico 1" descr="Se organiza en tres partes principales: introducción, cuerpo argumentativo y conclusión. En la introducción se encuentra el planteamiento de la tesis y la hipótesis. El cuerpo argumentativo abarca la exposición de ideas y formulación de hipótesis, la presentación de argumentos demostrativos válidos y la refutación de objeciones. Finalmente, la conclusión incluye la confirmación de la tesis, la síntesis de las ideas expuestas y demostradas, aportaciones y sugerencias, así como nuevas propuestas deducidas."/>
+          <wp:inline distT="0" distB="0" distL="0" distR="0" wp14:anchorId="0DD816F7" wp14:editId="3BA0481B">
+            <wp:extent cx="5928852" cy="2079141"/>
+            <wp:effectExtent l="0" t="0" r="2540" b="3810"/>
+            <wp:docPr id="2107742954" name="Gráfico 3" descr="Se organiza en tres partes principales: introducción, cuerpo argumentativo y conclusión. En la introducción se encuentra el planteamiento de la tesis y la hipótesis. El cuerpo argumentativo abarca la exposición de ideas y formulación de hipótesis, la presentación de argumentos demostrativos válidos y la refutación de objeciones. Finalmente, la conclusión incluye la confirmación de la tesis, la síntesis de las ideas expuestas y demostradas, aportaciones y sugerencias, así como nuevas propuestas deducidas."/>
             <wp:cNvGraphicFramePr>
               <a:graphicFrameLocks xmlns:a="http://schemas.openxmlformats.org/drawingml/2006/main" noChangeAspect="1"/>
             </wp:cNvGraphicFramePr>
@@ -3689,7 +3686,7 @@
               <a:graphicData uri="http://schemas.openxmlformats.org/drawingml/2006/picture">
                 <pic:pic xmlns:pic="http://schemas.openxmlformats.org/drawingml/2006/picture">
                   <pic:nvPicPr>
-                    <pic:cNvPr id="867827319" name="Gráfico 1" descr="Se organiza en tres partes principales: introducción, cuerpo argumentativo y conclusión. En la introducción se encuentra el planteamiento de la tesis y la hipótesis. El cuerpo argumentativo abarca la exposición de ideas y formulación de hipótesis, la presentación de argumentos demostrativos válidos y la refutación de objeciones. Finalmente, la conclusión incluye la confirmación de la tesis, la síntesis de las ideas expuestas y demostradas, aportaciones y sugerencias, así como nuevas propuestas deducidas."/>
+                    <pic:cNvPr id="2107742954" name="Gráfico 3" descr="Se organiza en tres partes principales: introducción, cuerpo argumentativo y conclusión. En la introducción se encuentra el planteamiento de la tesis y la hipótesis. El cuerpo argumentativo abarca la exposición de ideas y formulación de hipótesis, la presentación de argumentos demostrativos válidos y la refutación de objeciones. Finalmente, la conclusión incluye la confirmación de la tesis, la síntesis de las ideas expuestas y demostradas, aportaciones y sugerencias, así como nuevas propuestas deducidas."/>
                     <pic:cNvPicPr/>
                   </pic:nvPicPr>
                   <pic:blipFill>
@@ -3707,7 +3704,7 @@
                   <pic:spPr>
                     <a:xfrm>
                       <a:off x="0" y="0"/>
-                      <a:ext cx="5897890" cy="2015644"/>
+                      <a:ext cx="5932589" cy="2080452"/>
                     </a:xfrm>
                     <a:prstGeom prst="rect">
                       <a:avLst/>
@@ -5292,7 +5289,7 @@
           <w:bCs/>
           <w:lang w:val="es-419" w:eastAsia="es-CO"/>
         </w:rPr>
-        <w:t>Citar significa</w:t>
+        <w:t>Según la RAE citar significa:</w:t>
       </w:r>
     </w:p>
     <w:p>
@@ -5317,7 +5314,7 @@
           <w:bCs/>
           <w:lang w:val="es-419" w:eastAsia="es-CO"/>
         </w:rPr>
-        <w:t>Referir, anotar o mencionar un autor, un texto, un lugar, etc., que se alega en lo que se dice o escribe …</w:t>
+        <w:t>Referir, anotar o mencionar un autor, un texto, un lugar, etc., que se alega en lo que se dice o escribe</w:t>
       </w:r>
       <w:r>
         <w:rPr>
@@ -5333,14 +5330,6 @@
           <w:bCs/>
           <w:lang w:val="es-419" w:eastAsia="es-CO"/>
         </w:rPr>
-        <w:t xml:space="preserve"> RAE</w:t>
-      </w:r>
-      <w:r>
-        <w:rPr>
-          <w:b/>
-          <w:bCs/>
-          <w:lang w:val="es-419" w:eastAsia="es-CO"/>
-        </w:rPr>
         <w:t>.</w:t>
       </w:r>
     </w:p>
@@ -5358,7 +5347,15 @@
           <w:bCs/>
           <w:lang w:val="es-419" w:eastAsia="es-CO"/>
         </w:rPr>
-        <w:t>“hacer mención de alguien o de algo.”</w:t>
+        <w:t>“hacer mención de alguien o de algo”</w:t>
+      </w:r>
+      <w:r>
+        <w:rPr>
+          <w:b/>
+          <w:bCs/>
+          <w:lang w:val="es-419" w:eastAsia="es-CO"/>
+        </w:rPr>
+        <w:t>.</w:t>
       </w:r>
       <w:r>
         <w:rPr>
@@ -5367,22 +5364,6 @@
           <w:lang w:val="es-419" w:eastAsia="es-CO"/>
         </w:rPr>
         <w:t xml:space="preserve"> </w:t>
-      </w:r>
-      <w:r>
-        <w:rPr>
-          <w:b/>
-          <w:bCs/>
-          <w:lang w:val="es-419" w:eastAsia="es-CO"/>
-        </w:rPr>
-        <w:t>RAE</w:t>
-      </w:r>
-      <w:r>
-        <w:rPr>
-          <w:b/>
-          <w:bCs/>
-          <w:lang w:val="es-419" w:eastAsia="es-CO"/>
-        </w:rPr>
-        <w:t>.</w:t>
       </w:r>
     </w:p>
     <w:p>
@@ -5864,7 +5845,13 @@
         <w:rPr>
           <w:lang w:val="es-419" w:eastAsia="es-CO"/>
         </w:rPr>
-        <w:t>Para el caso que ocupa este curso, se enfocará la utilización de herramientas tecnológicas en contextos profesionales, ya sea desde la formación o el desempeño profesional, de manera que la asertividad caracterice la forma de emitir comunicados por medios tecnológicos.</w:t>
+        <w:t>Para el caso que ocupa este componente formativo, se enfocará la utilización de herramientas tecnológicas en contextos profesionales, ya sea desde la formación o el desempeño profesional, de manera que la asertividad caracterice la forma de emitir comunicados por medios tecnológicos</w:t>
+      </w:r>
+      <w:r>
+        <w:rPr>
+          <w:lang w:val="es-419" w:eastAsia="es-CO"/>
+        </w:rPr>
+        <w:t>.</w:t>
       </w:r>
     </w:p>
     <w:p>
@@ -6716,7 +6703,15 @@
           <w:bCs/>
           <w:lang w:val="es-419" w:eastAsia="es-CO"/>
         </w:rPr>
-        <w:t>Asunto:</w:t>
+        <w:t>Saludo</w:t>
+      </w:r>
+      <w:r>
+        <w:rPr>
+          <w:b/>
+          <w:bCs/>
+          <w:lang w:val="es-419" w:eastAsia="es-CO"/>
+        </w:rPr>
+        <w:t>:</w:t>
       </w:r>
       <w:r>
         <w:rPr>
@@ -13532,16 +13527,15 @@
     <w:autoRedefine/>
     <w:uiPriority w:val="39"/>
     <w:unhideWhenUsed/>
-    <w:rsid w:val="00AD284A"/>
+    <w:rsid w:val="00945504"/>
     <w:pPr>
       <w:tabs>
-        <w:tab w:val="left" w:pos="709"/>
         <w:tab w:val="left" w:pos="1276"/>
         <w:tab w:val="left" w:pos="1920"/>
         <w:tab w:val="right" w:leader="dot" w:pos="9962"/>
       </w:tabs>
       <w:spacing w:after="100"/>
-      <w:ind w:left="708" w:firstLine="285"/>
+      <w:ind w:left="1701" w:hanging="708"/>
     </w:pPr>
     <w:rPr>
       <w:noProof/>
@@ -14179,8 +14173,21 @@
 </file>
 
 <file path=customXml/item2.xml><?xml version="1.0" encoding="utf-8"?>
-<ct:contentTypeSchema xmlns:ct="http://schemas.microsoft.com/office/2006/metadata/contentType" xmlns:ma="http://schemas.microsoft.com/office/2006/metadata/properties/metaAttributes" ct:_="" ma:_="" ma:contentTypeName="Documento" ma:contentTypeID="0x0101005D7421CBAB376F47AC1876466873BE0C" ma:contentTypeVersion="11" ma:contentTypeDescription="Crear nuevo documento." ma:contentTypeScope="" ma:versionID="3a1bba6d8728ce939bf9f95dae234b40">
-  <xsd:schema xmlns:xsd="http://www.w3.org/2001/XMLSchema" xmlns:xs="http://www.w3.org/2001/XMLSchema" xmlns:p="http://schemas.microsoft.com/office/2006/metadata/properties" xmlns:ns2="55abea07-cd72-4a95-add0-1082a24cf9e9" xmlns:ns3="285d351f-f218-493a-825f-85a9dfbde315" targetNamespace="http://schemas.microsoft.com/office/2006/metadata/properties" ma:root="true" ma:fieldsID="a4f96e62c8f781ccc064189483c2e669" ns2:_="" ns3:_="">
+<b:Sources xmlns:b="http://schemas.openxmlformats.org/officeDocument/2006/bibliography" xmlns="http://schemas.openxmlformats.org/officeDocument/2006/bibliography" SelectedStyle="\APASixthEditionOfficeOnline.xsl" StyleName="APA" Version="6"/>
+</file>
+
+<file path=customXml/item3.xml><?xml version="1.0" encoding="utf-8"?>
+<?mso-contentType ?>
+<FormTemplates xmlns="http://schemas.microsoft.com/sharepoint/v3/contenttype/forms">
+  <Display>DocumentLibraryForm</Display>
+  <Edit>DocumentLibraryForm</Edit>
+  <New>DocumentLibraryForm</New>
+</FormTemplates>
+</file>
+
+<file path=customXml/item4.xml><?xml version="1.0" encoding="utf-8"?>
+<ct:contentTypeSchema xmlns:ct="http://schemas.microsoft.com/office/2006/metadata/contentType" xmlns:ma="http://schemas.microsoft.com/office/2006/metadata/properties/metaAttributes" ct:_="" ma:_="" ma:contentTypeName="Documento" ma:contentTypeID="0x0101005D7421CBAB376F47AC1876466873BE0C" ma:contentTypeVersion="11" ma:contentTypeDescription="Crear nuevo documento." ma:contentTypeScope="" ma:versionID="2b4f891a1a5ad88e3e621500c8553ae4">
+  <xsd:schema xmlns:xsd="http://www.w3.org/2001/XMLSchema" xmlns:xs="http://www.w3.org/2001/XMLSchema" xmlns:p="http://schemas.microsoft.com/office/2006/metadata/properties" xmlns:ns2="55abea07-cd72-4a95-add0-1082a24cf9e9" xmlns:ns3="285d351f-f218-493a-825f-85a9dfbde315" targetNamespace="http://schemas.microsoft.com/office/2006/metadata/properties" ma:root="true" ma:fieldsID="4883b2e7c543eac85f1b7e21127c6f20" ns2:_="" ns3:_="">
     <xsd:import namespace="55abea07-cd72-4a95-add0-1082a24cf9e9"/>
     <xsd:import namespace="285d351f-f218-493a-825f-85a9dfbde315"/>
     <xsd:element name="properties">
@@ -14373,32 +14380,23 @@
 </ct:contentTypeSchema>
 </file>
 
-<file path=customXml/item3.xml><?xml version="1.0" encoding="utf-8"?>
-<?mso-contentType ?>
-<FormTemplates xmlns="http://schemas.microsoft.com/sharepoint/v3/contenttype/forms">
-  <Display>DocumentLibraryForm</Display>
-  <Edit>DocumentLibraryForm</Edit>
-  <New>DocumentLibraryForm</New>
-</FormTemplates>
-</file>
-
-<file path=customXml/item4.xml><?xml version="1.0" encoding="utf-8"?>
-<b:Sources xmlns:b="http://schemas.openxmlformats.org/officeDocument/2006/bibliography" xmlns="http://schemas.openxmlformats.org/officeDocument/2006/bibliography" SelectedStyle="\APASixthEditionOfficeOnline.xsl" StyleName="APA" Version="6"/>
-</file>
-
 <file path=customXml/itemProps1.xml><?xml version="1.0" encoding="utf-8"?>
 <ds:datastoreItem xmlns:ds="http://schemas.openxmlformats.org/officeDocument/2006/customXml" ds:itemID="{26259216-AD86-464A-AEAD-95B1F9E17392}">
   <ds:schemaRefs>
     <ds:schemaRef ds:uri="http://schemas.microsoft.com/office/2006/metadata/properties"/>
     <ds:schemaRef ds:uri="http://schemas.microsoft.com/office/infopath/2007/PartnerControls"/>
-    <ds:schemaRef ds:uri="cb45339b-ced9-4d0d-8f64-77573914d53b"/>
-    <ds:schemaRef ds:uri="43a3ca16-9c26-4813-b83f-4aec9927b43f"/>
+    <ds:schemaRef ds:uri="285d351f-f218-493a-825f-85a9dfbde315"/>
+    <ds:schemaRef ds:uri="55abea07-cd72-4a95-add0-1082a24cf9e9"/>
   </ds:schemaRefs>
 </ds:datastoreItem>
 </file>
 
 <file path=customXml/itemProps2.xml><?xml version="1.0" encoding="utf-8"?>
-<ds:datastoreItem xmlns:ds="http://schemas.openxmlformats.org/officeDocument/2006/customXml" ds:itemID="{346BAFE8-4CDF-49BF-99C9-CF385C6C272F}"/>
+<ds:datastoreItem xmlns:ds="http://schemas.openxmlformats.org/officeDocument/2006/customXml" ds:itemID="{A9F2CEBA-C824-4C86-81A8-E32CBD0EB92D}">
+  <ds:schemaRefs>
+    <ds:schemaRef ds:uri="http://schemas.openxmlformats.org/officeDocument/2006/bibliography"/>
+  </ds:schemaRefs>
+</ds:datastoreItem>
 </file>
 
 <file path=customXml/itemProps3.xml><?xml version="1.0" encoding="utf-8"?>
@@ -14410,9 +14408,5 @@
 </file>
 
 <file path=customXml/itemProps4.xml><?xml version="1.0" encoding="utf-8"?>
-<ds:datastoreItem xmlns:ds="http://schemas.openxmlformats.org/officeDocument/2006/customXml" ds:itemID="{A9F2CEBA-C824-4C86-81A8-E32CBD0EB92D}">
-  <ds:schemaRefs>
-    <ds:schemaRef ds:uri="http://schemas.openxmlformats.org/officeDocument/2006/bibliography"/>
-  </ds:schemaRefs>
-</ds:datastoreItem>
+<ds:datastoreItem xmlns:ds="http://schemas.openxmlformats.org/officeDocument/2006/customXml" ds:itemID="{A7DCF757-E3C3-4F03-A403-B28C726C114E}"/>
 </file>
</xml_diff>